<commit_message>
GDD updates and itch.io build
</commit_message>
<xml_diff>
--- a/KnowYourFriend_GDD.docx
+++ b/KnowYourFriend_GDD.docx
@@ -10699,23 +10699,7 @@
             <w:u w:val="single"/>
             <w:lang w:val="de-DE"/>
           </w:rPr>
-          <w:t>Google F</w:t>
-        </w:r>
-        <w:r>
-          <w:rPr>
-            <w:color w:val="0563C1"/>
-            <w:u w:val="single"/>
-            <w:lang w:val="de-DE"/>
-          </w:rPr>
-          <w:t>o</w:t>
-        </w:r>
-        <w:r>
-          <w:rPr>
-            <w:color w:val="0563C1"/>
-            <w:u w:val="single"/>
-            <w:lang w:val="de-DE"/>
-          </w:rPr>
-          <w:t>rms</w:t>
+          <w:t>Google Forms</w:t>
         </w:r>
       </w:hyperlink>
     </w:p>
@@ -13268,11 +13252,11 @@
     <w:p>
       <w:pPr>
         <w:pStyle w:val="berschrift1"/>
-        <w:pageBreakBefore/>
-        <w:pBdr>
-          <w:bottom w:val="single" w:sz="10" w:space="6" w:color="FF7D06"/>
-        </w:pBdr>
-        <w:spacing w:after="200"/>
+        <w:numPr>
+          <w:ilvl w:val="0"/>
+          <w:numId w:val="0"/>
+        </w:numPr>
+        <w:ind w:left="432" w:hanging="432"/>
         <w:rPr>
           <w:lang w:val="de-DE"/>
         </w:rPr>
@@ -13280,8 +13264,6 @@
       <w:bookmarkStart w:id="45" w:name="_Toc240615352"/>
       <w:r>
         <w:rPr>
-          <w:rFonts w:ascii="Arial" w:hAnsi="Arial"/>
-          <w:sz w:val="38"/>
           <w:lang w:val="de-DE"/>
         </w:rPr>
         <w:lastRenderedPageBreak/>
@@ -20253,6 +20235,101 @@
     </w:lvl>
   </w:abstractNum>
   <w:abstractNum w:abstractNumId="31" w15:restartNumberingAfterBreak="0">
+    <w:nsid w:val="30A85DFC"/>
+    <w:multiLevelType w:val="multilevel"/>
+    <w:tmpl w:val="04070025"/>
+    <w:lvl w:ilvl="0">
+      <w:start w:val="1"/>
+      <w:numFmt w:val="decimal"/>
+      <w:pStyle w:val="berschrift1"/>
+      <w:lvlText w:val="%1"/>
+      <w:lvlJc w:val="left"/>
+      <w:pPr>
+        <w:ind w:left="432" w:hanging="432"/>
+      </w:pPr>
+    </w:lvl>
+    <w:lvl w:ilvl="1">
+      <w:start w:val="1"/>
+      <w:numFmt w:val="decimal"/>
+      <w:pStyle w:val="berschrift2"/>
+      <w:lvlText w:val="%1.%2"/>
+      <w:lvlJc w:val="left"/>
+      <w:pPr>
+        <w:ind w:left="576" w:hanging="576"/>
+      </w:pPr>
+    </w:lvl>
+    <w:lvl w:ilvl="2">
+      <w:start w:val="1"/>
+      <w:numFmt w:val="decimal"/>
+      <w:pStyle w:val="berschrift3"/>
+      <w:lvlText w:val="%1.%2.%3"/>
+      <w:lvlJc w:val="left"/>
+      <w:pPr>
+        <w:ind w:left="720" w:hanging="720"/>
+      </w:pPr>
+    </w:lvl>
+    <w:lvl w:ilvl="3">
+      <w:start w:val="1"/>
+      <w:numFmt w:val="decimal"/>
+      <w:pStyle w:val="berschrift4"/>
+      <w:lvlText w:val="%1.%2.%3.%4"/>
+      <w:lvlJc w:val="left"/>
+      <w:pPr>
+        <w:ind w:left="864" w:hanging="864"/>
+      </w:pPr>
+    </w:lvl>
+    <w:lvl w:ilvl="4">
+      <w:start w:val="1"/>
+      <w:numFmt w:val="decimal"/>
+      <w:pStyle w:val="berschrift5"/>
+      <w:lvlText w:val="%1.%2.%3.%4.%5"/>
+      <w:lvlJc w:val="left"/>
+      <w:pPr>
+        <w:ind w:left="1008" w:hanging="1008"/>
+      </w:pPr>
+    </w:lvl>
+    <w:lvl w:ilvl="5">
+      <w:start w:val="1"/>
+      <w:numFmt w:val="decimal"/>
+      <w:pStyle w:val="berschrift6"/>
+      <w:lvlText w:val="%1.%2.%3.%4.%5.%6"/>
+      <w:lvlJc w:val="left"/>
+      <w:pPr>
+        <w:ind w:left="1152" w:hanging="1152"/>
+      </w:pPr>
+    </w:lvl>
+    <w:lvl w:ilvl="6">
+      <w:start w:val="1"/>
+      <w:numFmt w:val="decimal"/>
+      <w:pStyle w:val="berschrift7"/>
+      <w:lvlText w:val="%1.%2.%3.%4.%5.%6.%7"/>
+      <w:lvlJc w:val="left"/>
+      <w:pPr>
+        <w:ind w:left="1296" w:hanging="1296"/>
+      </w:pPr>
+    </w:lvl>
+    <w:lvl w:ilvl="7">
+      <w:start w:val="1"/>
+      <w:numFmt w:val="decimal"/>
+      <w:pStyle w:val="berschrift8"/>
+      <w:lvlText w:val="%1.%2.%3.%4.%5.%6.%7.%8"/>
+      <w:lvlJc w:val="left"/>
+      <w:pPr>
+        <w:ind w:left="1440" w:hanging="1440"/>
+      </w:pPr>
+    </w:lvl>
+    <w:lvl w:ilvl="8">
+      <w:start w:val="1"/>
+      <w:numFmt w:val="decimal"/>
+      <w:pStyle w:val="berschrift9"/>
+      <w:lvlText w:val="%1.%2.%3.%4.%5.%6.%7.%8.%9"/>
+      <w:lvlJc w:val="left"/>
+      <w:pPr>
+        <w:ind w:left="1584" w:hanging="1584"/>
+      </w:pPr>
+    </w:lvl>
+  </w:abstractNum>
+  <w:abstractNum w:abstractNumId="32" w15:restartNumberingAfterBreak="0">
     <w:nsid w:val="3809621C"/>
     <w:multiLevelType w:val="multilevel"/>
     <w:tmpl w:val="B15CA740"/>
@@ -20338,7 +20415,7 @@
       </w:pPr>
     </w:lvl>
   </w:abstractNum>
-  <w:abstractNum w:abstractNumId="32" w15:restartNumberingAfterBreak="0">
+  <w:abstractNum w:abstractNumId="33" w15:restartNumberingAfterBreak="0">
     <w:nsid w:val="38612E38"/>
     <w:multiLevelType w:val="multilevel"/>
     <w:tmpl w:val="AD56645A"/>
@@ -20424,7 +20501,7 @@
       </w:pPr>
     </w:lvl>
   </w:abstractNum>
-  <w:abstractNum w:abstractNumId="33" w15:restartNumberingAfterBreak="0">
+  <w:abstractNum w:abstractNumId="34" w15:restartNumberingAfterBreak="0">
     <w:nsid w:val="3EEB06C7"/>
     <w:multiLevelType w:val="multilevel"/>
     <w:tmpl w:val="906639EA"/>
@@ -20510,7 +20587,7 @@
       </w:pPr>
     </w:lvl>
   </w:abstractNum>
-  <w:abstractNum w:abstractNumId="34" w15:restartNumberingAfterBreak="0">
+  <w:abstractNum w:abstractNumId="35" w15:restartNumberingAfterBreak="0">
     <w:nsid w:val="40511935"/>
     <w:multiLevelType w:val="multilevel"/>
     <w:tmpl w:val="893E787C"/>
@@ -20627,7 +20704,7 @@
       </w:pPr>
     </w:lvl>
   </w:abstractNum>
-  <w:abstractNum w:abstractNumId="35" w15:restartNumberingAfterBreak="0">
+  <w:abstractNum w:abstractNumId="36" w15:restartNumberingAfterBreak="0">
     <w:nsid w:val="427D0821"/>
     <w:multiLevelType w:val="multilevel"/>
     <w:tmpl w:val="CF8CCFC4"/>
@@ -20713,7 +20790,7 @@
       </w:pPr>
     </w:lvl>
   </w:abstractNum>
-  <w:abstractNum w:abstractNumId="36" w15:restartNumberingAfterBreak="0">
+  <w:abstractNum w:abstractNumId="37" w15:restartNumberingAfterBreak="0">
     <w:nsid w:val="46560D71"/>
     <w:multiLevelType w:val="multilevel"/>
     <w:tmpl w:val="F7B0C7AC"/>
@@ -20799,7 +20876,7 @@
       </w:pPr>
     </w:lvl>
   </w:abstractNum>
-  <w:abstractNum w:abstractNumId="37" w15:restartNumberingAfterBreak="0">
+  <w:abstractNum w:abstractNumId="38" w15:restartNumberingAfterBreak="0">
     <w:nsid w:val="47333F81"/>
     <w:multiLevelType w:val="multilevel"/>
     <w:tmpl w:val="4A728BEC"/>
@@ -20885,7 +20962,7 @@
       </w:pPr>
     </w:lvl>
   </w:abstractNum>
-  <w:abstractNum w:abstractNumId="38" w15:restartNumberingAfterBreak="0">
+  <w:abstractNum w:abstractNumId="39" w15:restartNumberingAfterBreak="0">
     <w:nsid w:val="48D00E59"/>
     <w:multiLevelType w:val="multilevel"/>
     <w:tmpl w:val="319E0B20"/>
@@ -21002,7 +21079,7 @@
       </w:pPr>
     </w:lvl>
   </w:abstractNum>
-  <w:abstractNum w:abstractNumId="39" w15:restartNumberingAfterBreak="0">
+  <w:abstractNum w:abstractNumId="40" w15:restartNumberingAfterBreak="0">
     <w:nsid w:val="49DD62AB"/>
     <w:multiLevelType w:val="multilevel"/>
     <w:tmpl w:val="0D2C933A"/>
@@ -21088,7 +21165,7 @@
       </w:pPr>
     </w:lvl>
   </w:abstractNum>
-  <w:abstractNum w:abstractNumId="40" w15:restartNumberingAfterBreak="0">
+  <w:abstractNum w:abstractNumId="41" w15:restartNumberingAfterBreak="0">
     <w:nsid w:val="4A881005"/>
     <w:multiLevelType w:val="multilevel"/>
     <w:tmpl w:val="76B0AFB6"/>
@@ -21174,7 +21251,7 @@
       </w:pPr>
     </w:lvl>
   </w:abstractNum>
-  <w:abstractNum w:abstractNumId="41" w15:restartNumberingAfterBreak="0">
+  <w:abstractNum w:abstractNumId="42" w15:restartNumberingAfterBreak="0">
     <w:nsid w:val="4FC3350C"/>
     <w:multiLevelType w:val="multilevel"/>
     <w:tmpl w:val="9BC67938"/>
@@ -21288,7 +21365,7 @@
       </w:pPr>
     </w:lvl>
   </w:abstractNum>
-  <w:abstractNum w:abstractNumId="42" w15:restartNumberingAfterBreak="0">
+  <w:abstractNum w:abstractNumId="43" w15:restartNumberingAfterBreak="0">
     <w:nsid w:val="55403F4E"/>
     <w:multiLevelType w:val="multilevel"/>
     <w:tmpl w:val="0407001F"/>
@@ -21374,7 +21451,7 @@
       </w:pPr>
     </w:lvl>
   </w:abstractNum>
-  <w:abstractNum w:abstractNumId="43" w15:restartNumberingAfterBreak="0">
+  <w:abstractNum w:abstractNumId="44" w15:restartNumberingAfterBreak="0">
     <w:nsid w:val="57593D31"/>
     <w:multiLevelType w:val="multilevel"/>
     <w:tmpl w:val="04070025"/>
@@ -21460,7 +21537,7 @@
       </w:pPr>
     </w:lvl>
   </w:abstractNum>
-  <w:abstractNum w:abstractNumId="44" w15:restartNumberingAfterBreak="0">
+  <w:abstractNum w:abstractNumId="45" w15:restartNumberingAfterBreak="0">
     <w:nsid w:val="57F77987"/>
     <w:multiLevelType w:val="multilevel"/>
     <w:tmpl w:val="04070025"/>
@@ -21546,7 +21623,7 @@
       </w:pPr>
     </w:lvl>
   </w:abstractNum>
-  <w:abstractNum w:abstractNumId="45" w15:restartNumberingAfterBreak="0">
+  <w:abstractNum w:abstractNumId="46" w15:restartNumberingAfterBreak="0">
     <w:nsid w:val="5B7561D6"/>
     <w:multiLevelType w:val="multilevel"/>
     <w:tmpl w:val="4E7C8306"/>
@@ -21660,7 +21737,7 @@
       </w:pPr>
     </w:lvl>
   </w:abstractNum>
-  <w:abstractNum w:abstractNumId="46" w15:restartNumberingAfterBreak="0">
+  <w:abstractNum w:abstractNumId="47" w15:restartNumberingAfterBreak="0">
     <w:nsid w:val="5CA854B8"/>
     <w:multiLevelType w:val="multilevel"/>
     <w:tmpl w:val="8E863A92"/>
@@ -21746,7 +21823,7 @@
       </w:pPr>
     </w:lvl>
   </w:abstractNum>
-  <w:abstractNum w:abstractNumId="47" w15:restartNumberingAfterBreak="0">
+  <w:abstractNum w:abstractNumId="48" w15:restartNumberingAfterBreak="0">
     <w:nsid w:val="5CC669DE"/>
     <w:multiLevelType w:val="multilevel"/>
     <w:tmpl w:val="F77265E0"/>
@@ -21832,7 +21909,7 @@
       </w:pPr>
     </w:lvl>
   </w:abstractNum>
-  <w:abstractNum w:abstractNumId="48" w15:restartNumberingAfterBreak="0">
+  <w:abstractNum w:abstractNumId="49" w15:restartNumberingAfterBreak="0">
     <w:nsid w:val="5CE630F4"/>
     <w:multiLevelType w:val="multilevel"/>
     <w:tmpl w:val="21507B5A"/>
@@ -21918,7 +21995,7 @@
       </w:pPr>
     </w:lvl>
   </w:abstractNum>
-  <w:abstractNum w:abstractNumId="49" w15:restartNumberingAfterBreak="0">
+  <w:abstractNum w:abstractNumId="50" w15:restartNumberingAfterBreak="0">
     <w:nsid w:val="5EBB7CF3"/>
     <w:multiLevelType w:val="multilevel"/>
     <w:tmpl w:val="4D9EFDA4"/>
@@ -22004,7 +22081,7 @@
       </w:pPr>
     </w:lvl>
   </w:abstractNum>
-  <w:abstractNum w:abstractNumId="50" w15:restartNumberingAfterBreak="0">
+  <w:abstractNum w:abstractNumId="51" w15:restartNumberingAfterBreak="0">
     <w:nsid w:val="61E84928"/>
     <w:multiLevelType w:val="multilevel"/>
     <w:tmpl w:val="8F40255C"/>
@@ -22090,7 +22167,7 @@
       </w:pPr>
     </w:lvl>
   </w:abstractNum>
-  <w:abstractNum w:abstractNumId="51" w15:restartNumberingAfterBreak="0">
+  <w:abstractNum w:abstractNumId="52" w15:restartNumberingAfterBreak="0">
     <w:nsid w:val="65581A6F"/>
     <w:multiLevelType w:val="multilevel"/>
     <w:tmpl w:val="37FE61B0"/>
@@ -22176,7 +22253,7 @@
       </w:pPr>
     </w:lvl>
   </w:abstractNum>
-  <w:abstractNum w:abstractNumId="52" w15:restartNumberingAfterBreak="0">
+  <w:abstractNum w:abstractNumId="53" w15:restartNumberingAfterBreak="0">
     <w:nsid w:val="683917BF"/>
     <w:multiLevelType w:val="multilevel"/>
     <w:tmpl w:val="68945478"/>
@@ -22262,7 +22339,7 @@
       </w:pPr>
     </w:lvl>
   </w:abstractNum>
-  <w:abstractNum w:abstractNumId="53" w15:restartNumberingAfterBreak="0">
+  <w:abstractNum w:abstractNumId="54" w15:restartNumberingAfterBreak="0">
     <w:nsid w:val="68C4677D"/>
     <w:multiLevelType w:val="multilevel"/>
     <w:tmpl w:val="F71EFB8C"/>
@@ -22348,7 +22425,7 @@
       </w:pPr>
     </w:lvl>
   </w:abstractNum>
-  <w:abstractNum w:abstractNumId="54" w15:restartNumberingAfterBreak="0">
+  <w:abstractNum w:abstractNumId="55" w15:restartNumberingAfterBreak="0">
     <w:nsid w:val="692A3E8D"/>
     <w:multiLevelType w:val="multilevel"/>
     <w:tmpl w:val="CF8E1590"/>
@@ -22434,7 +22511,7 @@
       </w:pPr>
     </w:lvl>
   </w:abstractNum>
-  <w:abstractNum w:abstractNumId="55" w15:restartNumberingAfterBreak="0">
+  <w:abstractNum w:abstractNumId="56" w15:restartNumberingAfterBreak="0">
     <w:nsid w:val="724A4716"/>
     <w:multiLevelType w:val="multilevel"/>
     <w:tmpl w:val="D9CC10EA"/>
@@ -22520,7 +22597,7 @@
       </w:pPr>
     </w:lvl>
   </w:abstractNum>
-  <w:abstractNum w:abstractNumId="56" w15:restartNumberingAfterBreak="0">
+  <w:abstractNum w:abstractNumId="57" w15:restartNumberingAfterBreak="0">
     <w:nsid w:val="75E23E0E"/>
     <w:multiLevelType w:val="multilevel"/>
     <w:tmpl w:val="9EE2DE2E"/>
@@ -22642,7 +22719,7 @@
       </w:pPr>
     </w:lvl>
   </w:abstractNum>
-  <w:abstractNum w:abstractNumId="57" w15:restartNumberingAfterBreak="0">
+  <w:abstractNum w:abstractNumId="58" w15:restartNumberingAfterBreak="0">
     <w:nsid w:val="783D1165"/>
     <w:multiLevelType w:val="multilevel"/>
     <w:tmpl w:val="0407001F"/>
@@ -22728,14 +22805,13 @@
       </w:pPr>
     </w:lvl>
   </w:abstractNum>
-  <w:abstractNum w:abstractNumId="58" w15:restartNumberingAfterBreak="0">
+  <w:abstractNum w:abstractNumId="59" w15:restartNumberingAfterBreak="0">
     <w:nsid w:val="7857665A"/>
     <w:multiLevelType w:val="multilevel"/>
-    <w:tmpl w:val="04070025"/>
+    <w:tmpl w:val="54C6B05A"/>
     <w:lvl w:ilvl="0">
       <w:start w:val="1"/>
       <w:numFmt w:val="decimal"/>
-      <w:pStyle w:val="berschrift1"/>
       <w:lvlText w:val="%1"/>
       <w:lvlJc w:val="left"/>
       <w:pPr>
@@ -22745,7 +22821,6 @@
     <w:lvl w:ilvl="1">
       <w:start w:val="1"/>
       <w:numFmt w:val="decimal"/>
-      <w:pStyle w:val="berschrift2"/>
       <w:lvlText w:val="%1.%2"/>
       <w:lvlJc w:val="left"/>
       <w:pPr>
@@ -22755,7 +22830,6 @@
     <w:lvl w:ilvl="2">
       <w:start w:val="1"/>
       <w:numFmt w:val="decimal"/>
-      <w:pStyle w:val="berschrift3"/>
       <w:lvlText w:val="%1.%2.%3"/>
       <w:lvlJc w:val="left"/>
       <w:pPr>
@@ -22765,7 +22839,6 @@
     <w:lvl w:ilvl="3">
       <w:start w:val="1"/>
       <w:numFmt w:val="decimal"/>
-      <w:pStyle w:val="berschrift4"/>
       <w:lvlText w:val="%1.%2.%3.%4"/>
       <w:lvlJc w:val="left"/>
       <w:pPr>
@@ -22775,7 +22848,6 @@
     <w:lvl w:ilvl="4">
       <w:start w:val="1"/>
       <w:numFmt w:val="decimal"/>
-      <w:pStyle w:val="berschrift5"/>
       <w:lvlText w:val="%1.%2.%3.%4.%5"/>
       <w:lvlJc w:val="left"/>
       <w:pPr>
@@ -22785,7 +22857,6 @@
     <w:lvl w:ilvl="5">
       <w:start w:val="1"/>
       <w:numFmt w:val="decimal"/>
-      <w:pStyle w:val="berschrift6"/>
       <w:lvlText w:val="%1.%2.%3.%4.%5.%6"/>
       <w:lvlJc w:val="left"/>
       <w:pPr>
@@ -22795,7 +22866,6 @@
     <w:lvl w:ilvl="6">
       <w:start w:val="1"/>
       <w:numFmt w:val="decimal"/>
-      <w:pStyle w:val="berschrift7"/>
       <w:lvlText w:val="%1.%2.%3.%4.%5.%6.%7"/>
       <w:lvlJc w:val="left"/>
       <w:pPr>
@@ -22805,7 +22875,6 @@
     <w:lvl w:ilvl="7">
       <w:start w:val="1"/>
       <w:numFmt w:val="decimal"/>
-      <w:pStyle w:val="berschrift8"/>
       <w:lvlText w:val="%1.%2.%3.%4.%5.%6.%7.%8"/>
       <w:lvlJc w:val="left"/>
       <w:pPr>
@@ -22815,7 +22884,6 @@
     <w:lvl w:ilvl="8">
       <w:start w:val="1"/>
       <w:numFmt w:val="decimal"/>
-      <w:pStyle w:val="berschrift9"/>
       <w:lvlText w:val="%1.%2.%3.%4.%5.%6.%7.%8.%9"/>
       <w:lvlJc w:val="left"/>
       <w:pPr>
@@ -22824,31 +22892,31 @@
     </w:lvl>
   </w:abstractNum>
   <w:num w:numId="1" w16cid:durableId="896362055">
-    <w:abstractNumId w:val="38"/>
+    <w:abstractNumId w:val="39"/>
   </w:num>
   <w:num w:numId="2" w16cid:durableId="441075841">
     <w:abstractNumId w:val="28"/>
   </w:num>
   <w:num w:numId="3" w16cid:durableId="546138645">
-    <w:abstractNumId w:val="34"/>
+    <w:abstractNumId w:val="35"/>
   </w:num>
   <w:num w:numId="4" w16cid:durableId="1592425081">
-    <w:abstractNumId w:val="45"/>
+    <w:abstractNumId w:val="46"/>
   </w:num>
   <w:num w:numId="5" w16cid:durableId="1492722758">
     <w:abstractNumId w:val="10"/>
   </w:num>
   <w:num w:numId="6" w16cid:durableId="13044069">
-    <w:abstractNumId w:val="41"/>
+    <w:abstractNumId w:val="42"/>
   </w:num>
   <w:num w:numId="7" w16cid:durableId="549734674">
-    <w:abstractNumId w:val="56"/>
+    <w:abstractNumId w:val="57"/>
   </w:num>
   <w:num w:numId="8" w16cid:durableId="1882786348">
-    <w:abstractNumId w:val="52"/>
+    <w:abstractNumId w:val="53"/>
   </w:num>
   <w:num w:numId="9" w16cid:durableId="550071712">
-    <w:abstractNumId w:val="42"/>
+    <w:abstractNumId w:val="43"/>
   </w:num>
   <w:num w:numId="10" w16cid:durableId="23874498">
     <w:abstractNumId w:val="25"/>
@@ -22860,10 +22928,10 @@
     <w:abstractNumId w:val="9"/>
   </w:num>
   <w:num w:numId="13" w16cid:durableId="1292520134">
-    <w:abstractNumId w:val="44"/>
+    <w:abstractNumId w:val="45"/>
   </w:num>
   <w:num w:numId="14" w16cid:durableId="943418110">
-    <w:abstractNumId w:val="49"/>
+    <w:abstractNumId w:val="50"/>
   </w:num>
   <w:num w:numId="15" w16cid:durableId="2123454066">
     <w:abstractNumId w:val="11"/>
@@ -22878,7 +22946,7 @@
     <w:abstractNumId w:val="16"/>
   </w:num>
   <w:num w:numId="19" w16cid:durableId="1215119400">
-    <w:abstractNumId w:val="57"/>
+    <w:abstractNumId w:val="58"/>
   </w:num>
   <w:num w:numId="20" w16cid:durableId="1345016221">
     <w:abstractNumId w:val="26"/>
@@ -22887,7 +22955,7 @@
     <w:abstractNumId w:val="30"/>
   </w:num>
   <w:num w:numId="22" w16cid:durableId="556551021">
-    <w:abstractNumId w:val="43"/>
+    <w:abstractNumId w:val="44"/>
   </w:num>
   <w:num w:numId="23" w16cid:durableId="1455368557">
     <w:abstractNumId w:val="0"/>
@@ -22896,37 +22964,37 @@
     <w:abstractNumId w:val="15"/>
   </w:num>
   <w:num w:numId="25" w16cid:durableId="633870805">
-    <w:abstractNumId w:val="33"/>
+    <w:abstractNumId w:val="34"/>
   </w:num>
   <w:num w:numId="26" w16cid:durableId="1712877706">
-    <w:abstractNumId w:val="31"/>
+    <w:abstractNumId w:val="32"/>
   </w:num>
   <w:num w:numId="27" w16cid:durableId="711030093">
-    <w:abstractNumId w:val="50"/>
+    <w:abstractNumId w:val="51"/>
   </w:num>
   <w:num w:numId="28" w16cid:durableId="871308578">
-    <w:abstractNumId w:val="36"/>
+    <w:abstractNumId w:val="37"/>
   </w:num>
   <w:num w:numId="29" w16cid:durableId="1452281482">
-    <w:abstractNumId w:val="55"/>
+    <w:abstractNumId w:val="56"/>
   </w:num>
   <w:num w:numId="30" w16cid:durableId="857474352">
-    <w:abstractNumId w:val="32"/>
+    <w:abstractNumId w:val="33"/>
   </w:num>
   <w:num w:numId="31" w16cid:durableId="1523785572">
     <w:abstractNumId w:val="3"/>
   </w:num>
   <w:num w:numId="32" w16cid:durableId="1004555448">
-    <w:abstractNumId w:val="51"/>
+    <w:abstractNumId w:val="52"/>
   </w:num>
   <w:num w:numId="33" w16cid:durableId="23870062">
-    <w:abstractNumId w:val="47"/>
+    <w:abstractNumId w:val="48"/>
   </w:num>
   <w:num w:numId="34" w16cid:durableId="1574777645">
     <w:abstractNumId w:val="8"/>
   </w:num>
   <w:num w:numId="35" w16cid:durableId="197201128">
-    <w:abstractNumId w:val="39"/>
+    <w:abstractNumId w:val="40"/>
   </w:num>
   <w:num w:numId="36" w16cid:durableId="2062165971">
     <w:abstractNumId w:val="6"/>
@@ -22938,19 +23006,19 @@
     <w:abstractNumId w:val="1"/>
   </w:num>
   <w:num w:numId="39" w16cid:durableId="840853046">
-    <w:abstractNumId w:val="54"/>
+    <w:abstractNumId w:val="55"/>
   </w:num>
   <w:num w:numId="40" w16cid:durableId="520163022">
     <w:abstractNumId w:val="27"/>
   </w:num>
   <w:num w:numId="41" w16cid:durableId="631060248">
-    <w:abstractNumId w:val="48"/>
+    <w:abstractNumId w:val="49"/>
   </w:num>
   <w:num w:numId="42" w16cid:durableId="1414741553">
     <w:abstractNumId w:val="29"/>
   </w:num>
   <w:num w:numId="43" w16cid:durableId="122622675">
-    <w:abstractNumId w:val="53"/>
+    <w:abstractNumId w:val="54"/>
   </w:num>
   <w:num w:numId="44" w16cid:durableId="1354460908">
     <w:abstractNumId w:val="23"/>
@@ -22959,13 +23027,13 @@
     <w:abstractNumId w:val="5"/>
   </w:num>
   <w:num w:numId="46" w16cid:durableId="1352531985">
-    <w:abstractNumId w:val="37"/>
+    <w:abstractNumId w:val="38"/>
   </w:num>
   <w:num w:numId="47" w16cid:durableId="179660835">
-    <w:abstractNumId w:val="46"/>
+    <w:abstractNumId w:val="47"/>
   </w:num>
   <w:num w:numId="48" w16cid:durableId="1321076674">
-    <w:abstractNumId w:val="35"/>
+    <w:abstractNumId w:val="36"/>
   </w:num>
   <w:num w:numId="49" w16cid:durableId="374426345">
     <w:abstractNumId w:val="7"/>
@@ -22995,10 +23063,13 @@
     <w:abstractNumId w:val="12"/>
   </w:num>
   <w:num w:numId="58" w16cid:durableId="162668500">
-    <w:abstractNumId w:val="40"/>
+    <w:abstractNumId w:val="41"/>
   </w:num>
   <w:num w:numId="59" w16cid:durableId="236936621">
-    <w:abstractNumId w:val="58"/>
+    <w:abstractNumId w:val="59"/>
+  </w:num>
+  <w:num w:numId="60" w16cid:durableId="270599465">
+    <w:abstractNumId w:val="31"/>
   </w:num>
 </w:numbering>
 </file>
@@ -23413,7 +23484,7 @@
       <w:keepNext/>
       <w:keepLines/>
       <w:numPr>
-        <w:numId w:val="59"/>
+        <w:numId w:val="60"/>
       </w:numPr>
       <w:spacing w:after="160"/>
       <w:outlineLvl w:val="0"/>
@@ -23440,7 +23511,7 @@
       <w:keepLines/>
       <w:numPr>
         <w:ilvl w:val="1"/>
-        <w:numId w:val="59"/>
+        <w:numId w:val="60"/>
       </w:numPr>
       <w:spacing w:before="220" w:after="80"/>
       <w:outlineLvl w:val="1"/>
@@ -23468,7 +23539,7 @@
       <w:keepLines/>
       <w:numPr>
         <w:ilvl w:val="2"/>
-        <w:numId w:val="59"/>
+        <w:numId w:val="60"/>
       </w:numPr>
       <w:spacing w:before="200" w:after="0"/>
       <w:outlineLvl w:val="2"/>
@@ -23495,7 +23566,7 @@
       <w:keepLines/>
       <w:numPr>
         <w:ilvl w:val="3"/>
-        <w:numId w:val="59"/>
+        <w:numId w:val="60"/>
       </w:numPr>
       <w:spacing w:before="200" w:after="0"/>
       <w:outlineLvl w:val="3"/>
@@ -23524,7 +23595,7 @@
       <w:keepLines/>
       <w:numPr>
         <w:ilvl w:val="4"/>
-        <w:numId w:val="59"/>
+        <w:numId w:val="60"/>
       </w:numPr>
       <w:spacing w:before="200" w:after="0"/>
       <w:outlineLvl w:val="4"/>
@@ -23549,7 +23620,7 @@
       <w:keepLines/>
       <w:numPr>
         <w:ilvl w:val="5"/>
-        <w:numId w:val="59"/>
+        <w:numId w:val="60"/>
       </w:numPr>
       <w:spacing w:before="200" w:after="0"/>
       <w:outlineLvl w:val="5"/>
@@ -23576,7 +23647,7 @@
       <w:keepLines/>
       <w:numPr>
         <w:ilvl w:val="6"/>
-        <w:numId w:val="59"/>
+        <w:numId w:val="60"/>
       </w:numPr>
       <w:spacing w:before="200" w:after="0"/>
       <w:outlineLvl w:val="6"/>
@@ -23603,7 +23674,7 @@
       <w:keepLines/>
       <w:numPr>
         <w:ilvl w:val="7"/>
-        <w:numId w:val="59"/>
+        <w:numId w:val="60"/>
       </w:numPr>
       <w:spacing w:before="200" w:after="0"/>
       <w:outlineLvl w:val="7"/>
@@ -23630,7 +23701,7 @@
       <w:keepLines/>
       <w:numPr>
         <w:ilvl w:val="8"/>
-        <w:numId w:val="59"/>
+        <w:numId w:val="60"/>
       </w:numPr>
       <w:spacing w:before="200" w:after="0"/>
       <w:outlineLvl w:val="8"/>

</xml_diff>